<commit_message>
Add level_reason (why this level) to Task 2 and the hand-over file
- assessments.json gets an optional level_reason; Task 2 shows it in a
  'Why the system proposes this' card
- rationale in Task 1 no longer names the level
- demo data regenerated for Sakai and NiFi
- requirements: level_reason, evidence unit totals (3,000 / 3,387)
</commit_message>
<xml_diff>
--- a/docs/DevSkill_Requirements.docx
+++ b/docs/DevSkill_Requirements.docx
@@ -442,7 +442,7 @@
               <w:rPr>
                 <w:rFonts w:ascii="Calibri" w:cs="Calibri" w:eastAsia="Calibri" w:hAnsi="Calibri"/>
               </w:rPr>
-              <w:t xml:space="preserve">For every person and competence, a large language model (LLM) places the person on a level, based on the competences and levels defined below. The level is shown with a confidence and a short reason. The lead decides what to take over.</w:t>
+              <w:t xml:space="preserve">For every person and competence, a large language model (LLM) places the person on a level, based on the competences and levels defined below. The level is shown with a confidence and a reason that says why this level and not the next one up (autonomy, complexity, influence). The lead decides what to take over.</w:t>
             </w:r>
           </w:p>
         </w:tc>
@@ -2459,7 +2459,7 @@
                 <w:sz w:val="21"/>
                 <w:szCs w:val="21"/>
               </w:rPr>
-              <w:t xml:space="preserve">Has touched it</w:t>
+              <w:t xml:space="preserve">Follows a given approach</w:t>
             </w:r>
           </w:p>
         </w:tc>
@@ -2488,7 +2488,7 @@
                 <w:sz w:val="21"/>
                 <w:szCs w:val="21"/>
               </w:rPr>
-              <w:t xml:space="preserve">Mechanical or cosmetic change, approach set by others</w:t>
+              <w:t xml:space="preserve">Small, mechanical change; others set the approach</w:t>
             </w:r>
           </w:p>
         </w:tc>
@@ -2552,7 +2552,7 @@
                 <w:sz w:val="21"/>
                 <w:szCs w:val="21"/>
               </w:rPr>
-              <w:t xml:space="preserve">Works on its own</w:t>
+              <w:t xml:space="preserve">Completes routine tasks alone</w:t>
             </w:r>
           </w:p>
         </w:tc>
@@ -2581,7 +2581,7 @@
                 <w:sz w:val="21"/>
                 <w:szCs w:val="21"/>
               </w:rPr>
-              <w:t xml:space="preserve">Finishes ordinary tasks alone, no substantial rework</w:t>
+              <w:t xml:space="preserve">Own approach, routine task in a known pattern, no substantial rework</w:t>
             </w:r>
           </w:p>
         </w:tc>
@@ -2645,7 +2645,7 @@
                 <w:sz w:val="21"/>
                 <w:szCs w:val="21"/>
               </w:rPr>
-              <w:t xml:space="preserve">Goes beneath the symptom</w:t>
+              <w:t xml:space="preserve">Solves and explains the cause</w:t>
             </w:r>
           </w:p>
         </w:tc>
@@ -2674,7 +2674,7 @@
                 <w:sz w:val="21"/>
                 <w:szCs w:val="21"/>
               </w:rPr>
-              <w:t xml:space="preserve">Finds the cause or restructures, and explains why</w:t>
+              <w:t xml:space="preserve">Own approach, non-routine task; finds the cause or restructures, and explains why</w:t>
             </w:r>
           </w:p>
         </w:tc>
@@ -2738,7 +2738,7 @@
                 <w:sz w:val="21"/>
                 <w:szCs w:val="21"/>
               </w:rPr>
-              <w:t xml:space="preserve">Others build on it</w:t>
+              <w:t xml:space="preserve">Others rely on it</w:t>
             </w:r>
           </w:p>
         </w:tc>
@@ -2831,7 +2831,7 @@
                 <w:sz w:val="21"/>
                 <w:szCs w:val="21"/>
               </w:rPr>
-              <w:t xml:space="preserve">Is the reference</w:t>
+              <w:t xml:space="preserve">Sets the approach for others</w:t>
             </w:r>
           </w:p>
         </w:tc>
@@ -2860,7 +2860,7 @@
                 <w:sz w:val="21"/>
                 <w:szCs w:val="21"/>
               </w:rPr>
-              <w:t xml:space="preserve">The reference, sets the approach</w:t>
+              <w:t xml:space="preserve">Others turn to the person; the approach the project follows</w:t>
             </w:r>
           </w:p>
         </w:tc>
@@ -2977,6 +2977,25 @@
       <w:r>
         <w:rPr>
           <w:rFonts w:ascii="Calibri" w:cs="Calibri" w:eastAsia="Calibri" w:hAnsi="Calibri"/>
+          <w:b/>
+          <w:bCs/>
+        </w:rPr>
+        <w:t xml:space="preserve">Levels describe behaviour, not the person. </w:t>
+      </w:r>
+      <w:r>
+        <w:rPr>
+          <w:rFonts w:ascii="Calibri" w:cs="Calibri" w:eastAsia="Calibri" w:hAnsi="Calibri"/>
+        </w:rPr>
+        <w:t xml:space="preserve">Each level answers the same three questions, taken from the e-CF: who sets the approach (autonomy), how complex the task is (complexity), and who relies on the result (influence). A level is evidence for one competence in the records, never a label such as beginner or expert.</w:t>
+      </w:r>
+    </w:p>
+    <w:p>
+      <w:pPr>
+        <w:spacing w:after="120"/>
+      </w:pPr>
+      <w:r>
+        <w:rPr>
+          <w:rFonts w:ascii="Calibri" w:cs="Calibri" w:eastAsia="Calibri" w:hAnsi="Calibri"/>
         </w:rPr>
         <w:t xml:space="preserve">The e-CF itself defines levels only up to e-3 or e-4 for most build competences, so l4 and l5 go beyond it.</w:t>
       </w:r>
@@ -3195,7 +3214,21 @@
           <w:sz w:val="18"/>
           <w:szCs w:val="18"/>
         </w:rPr>
-        <w:t xml:space="preserve">      "rationale": "statement of what the records show",</w:t>
+        <w:t xml:space="preserve">      "rationale": "statement of what the records show (must not name the level)",</w:t>
+      </w:r>
+    </w:p>
+    <w:p>
+      <w:pPr>
+        <w:shd w:fill="F3F4F1" w:color="auto" w:val="clear"/>
+        <w:spacing w:after="0"/>
+      </w:pPr>
+      <w:r>
+        <w:rPr>
+          <w:rFonts w:ascii="Consolas" w:cs="Consolas" w:eastAsia="Consolas" w:hAnsi="Consolas"/>
+          <w:sz w:val="18"/>
+          <w:szCs w:val="18"/>
+        </w:rPr>
+        <w:t xml:space="preserve">      "level_reason": "why this level: who set the approach, how complex, who relies on it, and why not the next level up",</w:t>
       </w:r>
     </w:p>
     <w:p>

</xml_diff>